<commit_message>
ProCaps DAM: add Dropbox/Google Drive experience (score 53); record in master profile
Co-Authored-By: Claude Opus 5.5 <noreply@anthropic.com>
Claude-Session: https://claude.ai/code/session_01XE6aV5LP3W9C1iWzBfgedS
</commit_message>
<xml_diff>
--- a/applications/procaps-digital-asset-manager/ProCaps-DigitalAssetManager-Resume.docx
+++ b/applications/procaps-digital-asset-manager/ProCaps-DigitalAssetManager-Resume.docx
@@ -80,7 +80,7 @@
           <w:i w:val="0"/>
           <w:color w:val="1A1A1A"/>
         </w:rPr>
-        <w:t>Marketing operations builder with 15+ years across e-commerce, SaaS, and agency roles, specializing in the systems behind the content: taxonomy, naming and tagging standards, and workflows that let teams find the right approved thing without asking. Built e-commerce storefronts for established retail brands at Wix, defined the CRM field standards for onboarding workflows while leading a 20-person team, and runs technical SEO (site crawls, schema, on-page fixes inside client CMS platforms) at Solenzo. Connects systems with Zapier, Make, and n8n to cut manual downloading, renaming, and re-uploading. Trains non-technical users until the system sticks. Denver metro based, ready for hybrid in Broomfield.</w:t>
+        <w:t>Marketing operations builder with 15+ years across e-commerce, SaaS, and agency roles, specializing in the systems behind the content: taxonomy, naming and tagging standards, and workflows that let teams find the right approved thing without asking. Built e-commerce storefronts for established retail brands at Wix, defined the CRM field standards for onboarding workflows while leading a 20-person team, and runs technical SEO (site crawls, schema, on-page fixes inside client CMS platforms) at Solenzo. Connects systems with Zapier, Make, and n8n to cut manual downloading, renaming, and re-uploading. Has worked in shared file and asset libraries (Dropbox, Google Drive) in every role, and trains non-technical users until the system sticks. Denver metro based, ready for hybrid in Broomfield.</w:t>
       </w:r>
     </w:p>
     <w:p>
@@ -973,7 +973,7 @@
           <w:i w:val="0"/>
           <w:color w:val="1A1A1A"/>
         </w:rPr>
-        <w:t>CMS Platforms, HTML/CSS, Zapier, Make, n8n, HubSpot, Salesforce, GoHighLevel, Notion</w:t>
+        <w:t>Dropbox, Google Drive, CMS Platforms, HTML/CSS, Zapier, Make, n8n, HubSpot, Salesforce, GoHighLevel, Notion</w:t>
       </w:r>
     </w:p>
     <w:p>

</xml_diff>